<commit_message>
Thesis Chapter 6: decentralised identity and authority trust (RO2), with the combined Chapters 1-6 file
Co-Authored-By: Claude Fable 5.1 <noreply@anthropic.com>
Claude-Session: https://claude.ai/code/session_01QHSSv245Aernyaebt7V5kS
</commit_message>
<xml_diff>
--- a/docs/Yasir_Thesis_Chapter1.docx
+++ b/docs/Yasir_Thesis_Chapter1.docx
@@ -5,6 +5,7 @@
     <w:p>
       <w:pPr>
         <w:pStyle w:val="1"/>
+        <w:keepNext/>
         <w:jc w:val="center"/>
       </w:pPr>
       <w:r>
@@ -49,6 +50,7 @@
     <w:p>
       <w:pPr>
         <w:pStyle w:val="1"/>
+        <w:keepNext/>
         <w:jc w:val="center"/>
       </w:pPr>
       <w:r>
@@ -111,6 +113,7 @@
     <w:p>
       <w:pPr>
         <w:pStyle w:val="1"/>
+        <w:keepNext/>
         <w:jc w:val="center"/>
       </w:pPr>
       <w:r>
@@ -182,6 +185,7 @@
     <w:p>
       <w:pPr>
         <w:pStyle w:val="1"/>
+        <w:keepNext/>
         <w:jc w:val="center"/>
       </w:pPr>
       <w:r>
@@ -199,6 +203,7 @@
     <w:p>
       <w:pPr>
         <w:pStyle w:val="1"/>
+        <w:keepNext/>
         <w:jc w:val="center"/>
       </w:pPr>
       <w:r>
@@ -216,6 +221,7 @@
     <w:p>
       <w:pPr>
         <w:pStyle w:val="1"/>
+        <w:keepNext/>
         <w:jc w:val="center"/>
       </w:pPr>
       <w:r>
@@ -326,6 +332,7 @@
     <w:p>
       <w:pPr>
         <w:pStyle w:val="1"/>
+        <w:keepNext/>
         <w:spacing w:before="360"/>
       </w:pPr>
       <w:r/>
@@ -346,6 +353,7 @@
     <w:p>
       <w:pPr>
         <w:pStyle w:val="2"/>
+        <w:keepNext/>
       </w:pPr>
       <w:r>
         <w:t>1.1 Introduction</w:t>
@@ -381,6 +389,7 @@
     <w:p>
       <w:pPr>
         <w:pStyle w:val="2"/>
+        <w:keepNext/>
       </w:pPr>
       <w:r>
         <w:t>1.2 Statement of the Problem</w:t>
@@ -408,6 +417,7 @@
     <w:p>
       <w:pPr>
         <w:pStyle w:val="2"/>
+        <w:keepNext/>
       </w:pPr>
       <w:r>
         <w:rPr>
@@ -457,6 +467,7 @@
     <w:p>
       <w:pPr>
         <w:pStyle w:val="2"/>
+        <w:keepNext/>
       </w:pPr>
       <w:r>
         <w:rPr>
@@ -477,6 +488,7 @@
     <w:p>
       <w:pPr>
         <w:pStyle w:val="3"/>
+        <w:keepNext/>
       </w:pPr>
       <w:r>
         <w:rPr>
@@ -497,6 +509,7 @@
     <w:p>
       <w:pPr>
         <w:pStyle w:val="3"/>
+        <w:keepNext/>
       </w:pPr>
       <w:r>
         <w:rPr>
@@ -517,6 +530,7 @@
     <w:p>
       <w:pPr>
         <w:pStyle w:val="3"/>
+        <w:keepNext/>
       </w:pPr>
       <w:r>
         <w:rPr>
@@ -537,6 +551,7 @@
     <w:p>
       <w:pPr>
         <w:pStyle w:val="2"/>
+        <w:keepNext/>
       </w:pPr>
       <w:r>
         <w:rPr>
@@ -566,6 +581,7 @@
     <w:p>
       <w:pPr>
         <w:pStyle w:val="2"/>
+        <w:keepNext/>
       </w:pPr>
       <w:r>
         <w:rPr>
@@ -586,6 +602,7 @@
     <w:p>
       <w:pPr>
         <w:pStyle w:val="2"/>
+        <w:keepNext/>
       </w:pPr>
       <w:r>
         <w:rPr>
@@ -606,6 +623,7 @@
     <w:p>
       <w:pPr>
         <w:pStyle w:val="2"/>
+        <w:keepNext/>
       </w:pPr>
       <w:r>
         <w:rPr>
@@ -626,6 +644,7 @@
     <w:p>
       <w:pPr>
         <w:pStyle w:val="3"/>
+        <w:keepNext/>
       </w:pPr>
       <w:r>
         <w:rPr>
@@ -646,6 +665,7 @@
     <w:p>
       <w:pPr>
         <w:pStyle w:val="2"/>
+        <w:keepNext/>
       </w:pPr>
       <w:r>
         <w:rPr>
@@ -666,6 +686,7 @@
     <w:p>
       <w:pPr>
         <w:pStyle w:val="2"/>
+        <w:keepNext/>
       </w:pPr>
       <w:r>
         <w:rPr>
@@ -704,6 +725,7 @@
     <w:p>
       <w:pPr>
         <w:pStyle w:val="2"/>
+        <w:keepNext/>
       </w:pPr>
       <w:r>
         <w:t>1.11 Research Contribution</w:t>
@@ -712,6 +734,7 @@
     <w:p>
       <w:pPr>
         <w:pStyle w:val="3"/>
+        <w:keepNext/>
       </w:pPr>
       <w:r>
         <w:t>1.11.1 Scientific Contribution</w:t>
@@ -729,6 +752,7 @@
     <w:p>
       <w:pPr>
         <w:pStyle w:val="3"/>
+        <w:keepNext/>
       </w:pPr>
       <w:r>
         <w:t>1.11.2 Social Contribution</w:t>
@@ -746,6 +770,7 @@
     <w:p>
       <w:pPr>
         <w:pStyle w:val="2"/>
+        <w:keepNext/>
       </w:pPr>
       <w:r>
         <w:rPr>
@@ -865,6 +890,7 @@
     <w:p>
       <w:pPr>
         <w:pStyle w:val="2"/>
+        <w:keepNext/>
       </w:pPr>
       <w:r>
         <w:rPr>

</xml_diff>